<commit_message>
Fold the useful parts of the archived drafts into the current documents
The runbook gets a which-window table and three more expected questions
(autoscaling, containers, what went wrong). Doc 4 gets the evolution in
the order I would do it, and what I would not do. Doc 7 gets the table of
what went wrong building this and the lesson from each.

Co-Authored-By: Claude Fable 5.1 <noreply@anthropic.com>
</commit_message>
<xml_diff>
--- a/docs/word/4-TOOLS.docx
+++ b/docs/word/4-TOOLS.docx
@@ -1175,40 +1175,100 @@
         <w:pStyle w:val="FirstParagraph"/>
       </w:pPr>
       <w:r>
-        <w:rPr>
-          <w:b/>
-          <w:bCs/>
-        </w:rPr>
-        <w:t xml:space="preserve">Trivy</w:t>
-      </w:r>
-      <w:r>
-        <w:t xml:space="preserve"> </w:t>
-      </w:r>
-      <w:r>
-        <w:t xml:space="preserve">scans container images for known vulnerabilities. It would slot in as a fifth check.</w:t>
-      </w:r>
-    </w:p>
-    <w:p>
-      <w:pPr>
-        <w:pStyle w:val="BodyText"/>
-      </w:pPr>
-      <w:r>
-        <w:rPr>
-          <w:b/>
-          <w:bCs/>
-        </w:rPr>
-        <w:t xml:space="preserve">Dependabot</w:t>
-      </w:r>
-      <w:r>
-        <w:t xml:space="preserve"> </w:t>
-      </w:r>
-      <w:r>
-        <w:t xml:space="preserve">watches for out of date libraries with known problems.</w:t>
-      </w:r>
-    </w:p>
-    <w:p>
-      <w:pPr>
-        <w:pStyle w:val="BodyText"/>
+        <w:t xml:space="preserve">In the order I would actually do it. The first two are worth doing whether or not the rest ever happens,</w:t>
+      </w:r>
+      <w:r>
+        <w:t xml:space="preserve"> </w:t>
+      </w:r>
+      <w:r>
+        <w:t xml:space="preserve">which is usually the sign of a sensible order.</w:t>
+      </w:r>
+    </w:p>
+    <w:p>
+      <w:pPr>
+        <w:pStyle w:val="Compact"/>
+        <w:numPr>
+          <w:ilvl w:val="0"/>
+          <w:numId w:val="1004"/>
+        </w:numPr>
+      </w:pPr>
+      <w:r>
+        <w:rPr>
+          <w:b/>
+          <w:bCs/>
+        </w:rPr>
+        <w:t xml:space="preserve">Trivy as a fifth check.</w:t>
+      </w:r>
+      <w:r>
+        <w:t xml:space="preserve"> </w:t>
+      </w:r>
+      <w:r>
+        <w:t xml:space="preserve">Scans container images and dependencies for known vulnerabilities.</w:t>
+      </w:r>
+      <w:r>
+        <w:t xml:space="preserve"> </w:t>
+      </w:r>
+      <w:r>
+        <w:t xml:space="preserve">Works today, no Kubernetes required, real value immediately.</w:t>
+      </w:r>
+    </w:p>
+    <w:p>
+      <w:pPr>
+        <w:pStyle w:val="Compact"/>
+        <w:numPr>
+          <w:ilvl w:val="0"/>
+          <w:numId w:val="1004"/>
+        </w:numPr>
+      </w:pPr>
+      <w:r>
+        <w:rPr>
+          <w:b/>
+          <w:bCs/>
+        </w:rPr>
+        <w:t xml:space="preserve">Containerise the application.</w:t>
+      </w:r>
+      <w:r>
+        <w:t xml:space="preserve"> </w:t>
+      </w:r>
+      <w:r>
+        <w:t xml:space="preserve">Not for scale. For a scannable artifact that step 1 can inspect</w:t>
+      </w:r>
+      <w:r>
+        <w:t xml:space="preserve"> </w:t>
+      </w:r>
+      <w:r>
+        <w:t xml:space="preserve">before it runs.</w:t>
+      </w:r>
+    </w:p>
+    <w:p>
+      <w:pPr>
+        <w:pStyle w:val="Compact"/>
+        <w:numPr>
+          <w:ilvl w:val="0"/>
+          <w:numId w:val="1004"/>
+        </w:numPr>
+      </w:pPr>
+      <w:r>
+        <w:rPr>
+          <w:b/>
+          <w:bCs/>
+        </w:rPr>
+        <w:t xml:space="preserve">Dependabot.</w:t>
+      </w:r>
+      <w:r>
+        <w:t xml:space="preserve"> </w:t>
+      </w:r>
+      <w:r>
+        <w:t xml:space="preserve">Watches for out-of-date libraries with known problems.</w:t>
+      </w:r>
+    </w:p>
+    <w:p>
+      <w:pPr>
+        <w:pStyle w:val="Compact"/>
+        <w:numPr>
+          <w:ilvl w:val="0"/>
+          <w:numId w:val="1004"/>
+        </w:numPr>
       </w:pPr>
       <w:r>
         <w:rPr>
@@ -1221,16 +1281,247 @@
         <w:t xml:space="preserve"> </w:t>
       </w:r>
       <w:r>
-        <w:t xml:space="preserve">I'm the only account on this repository, so I can't approve my own work. That's</w:t>
-      </w:r>
-      <w:r>
-        <w:t xml:space="preserve"> </w:t>
-      </w:r>
-      <w:r>
-        <w:t xml:space="preserve">the one gap I can't close on my own.</w:t>
+        <w:t xml:space="preserve">I am the only account on this repository, so I cannot approve my own work.</w:t>
+      </w:r>
+      <w:r>
+        <w:t xml:space="preserve"> </w:t>
+      </w:r>
+      <w:r>
+        <w:t xml:space="preserve">That is the one gap I cannot close on my own.</w:t>
+      </w:r>
+    </w:p>
+    <w:p>
+      <w:pPr>
+        <w:pStyle w:val="Compact"/>
+        <w:numPr>
+          <w:ilvl w:val="0"/>
+          <w:numId w:val="1004"/>
+        </w:numPr>
+      </w:pPr>
+      <w:r>
+        <w:rPr>
+          <w:b/>
+          <w:bCs/>
+        </w:rPr>
+        <w:t xml:space="preserve">k3s on the host, development only.</w:t>
+      </w:r>
+      <w:r>
+        <w:t xml:space="preserve"> </w:t>
+      </w:r>
+      <w:r>
+        <w:t xml:space="preserve">One node, prove the manifests, leave staging and production</w:t>
+      </w:r>
+      <w:r>
+        <w:t xml:space="preserve"> </w:t>
+      </w:r>
+      <w:r>
+        <w:t xml:space="preserve">on the current path until development is boring.</w:t>
+      </w:r>
+    </w:p>
+    <w:p>
+      <w:pPr>
+        <w:pStyle w:val="Compact"/>
+        <w:numPr>
+          <w:ilvl w:val="0"/>
+          <w:numId w:val="1004"/>
+        </w:numPr>
+      </w:pPr>
+      <w:r>
+        <w:rPr>
+          <w:b/>
+          <w:bCs/>
+        </w:rPr>
+        <w:t xml:space="preserve">Admission control - Gatekeeper or Kyverno.</w:t>
+      </w:r>
+      <w:r>
+        <w:t xml:space="preserve"> </w:t>
+      </w:r>
+      <w:r>
+        <w:t xml:space="preserve">The same policies the pipeline enforces before a</w:t>
+      </w:r>
+      <w:r>
+        <w:t xml:space="preserve"> </w:t>
+      </w:r>
+      <w:r>
+        <w:t xml:space="preserve">merge, enforced by the cluster when a workload appears. This has to come</w:t>
+      </w:r>
+      <w:r>
+        <w:t xml:space="preserve"> </w:t>
+      </w:r>
+      <w:r>
+        <w:rPr>
+          <w:i/>
+          <w:iCs/>
+        </w:rPr>
+        <w:t xml:space="preserve">before</w:t>
+      </w:r>
+      <w:r>
+        <w:t xml:space="preserve"> </w:t>
+      </w:r>
+      <w:r>
+        <w:t xml:space="preserve">autoscaling.</w:t>
+      </w:r>
+    </w:p>
+    <w:p>
+      <w:pPr>
+        <w:pStyle w:val="Compact"/>
+        <w:numPr>
+          <w:ilvl w:val="0"/>
+          <w:numId w:val="1004"/>
+        </w:numPr>
+      </w:pPr>
+      <w:r>
+        <w:rPr>
+          <w:b/>
+          <w:bCs/>
+        </w:rPr>
+        <w:t xml:space="preserve">Autoscaling, last.</w:t>
+      </w:r>
+      <w:r>
+        <w:t xml:space="preserve"> </w:t>
+      </w:r>
+      <w:r>
+        <w:t xml:space="preserve">On queue depth or latency, not CPU, and only once step 6 exists.</w:t>
       </w:r>
     </w:p>
     <w:bookmarkEnd w:id="29"/>
+    <w:bookmarkStart w:id="30" w:name="what-i-would-not-do"/>
+    <w:p>
+      <w:pPr>
+        <w:pStyle w:val="Heading1"/>
+      </w:pPr>
+      <w:r>
+        <w:t xml:space="preserve">What I would not do</w:t>
+      </w:r>
+    </w:p>
+    <w:p>
+      <w:pPr>
+        <w:pStyle w:val="Compact"/>
+        <w:numPr>
+          <w:ilvl w:val="0"/>
+          <w:numId w:val="1005"/>
+        </w:numPr>
+      </w:pPr>
+      <w:r>
+        <w:rPr>
+          <w:b/>
+          <w:bCs/>
+        </w:rPr>
+        <w:t xml:space="preserve">Kubernetes for four containers on one host.</w:t>
+      </w:r>
+      <w:r>
+        <w:t xml:space="preserve"> </w:t>
+      </w:r>
+      <w:r>
+        <w:t xml:space="preserve">The operational cost exceeds the benefit until</w:t>
+      </w:r>
+      <w:r>
+        <w:t xml:space="preserve"> </w:t>
+      </w:r>
+      <w:r>
+        <w:t xml:space="preserve">there is a real scheduling or multi-tenancy problem to solve.</w:t>
+      </w:r>
+    </w:p>
+    <w:p>
+      <w:pPr>
+        <w:pStyle w:val="Compact"/>
+        <w:numPr>
+          <w:ilvl w:val="0"/>
+          <w:numId w:val="1005"/>
+        </w:numPr>
+      </w:pPr>
+      <w:r>
+        <w:rPr>
+          <w:b/>
+          <w:bCs/>
+        </w:rPr>
+        <w:t xml:space="preserve">Autoscaling before admission control.</w:t>
+      </w:r>
+      <w:r>
+        <w:t xml:space="preserve"> </w:t>
+      </w:r>
+      <w:r>
+        <w:t xml:space="preserve">Workloads appearing without a human, with no runtime</w:t>
+      </w:r>
+      <w:r>
+        <w:t xml:space="preserve"> </w:t>
+      </w:r>
+      <w:r>
+        <w:t xml:space="preserve">policy, is strictly worse than what exists now: CI-time policy becomes insufficient the moment a</w:t>
+      </w:r>
+      <w:r>
+        <w:t xml:space="preserve"> </w:t>
+      </w:r>
+      <w:r>
+        <w:t xml:space="preserve">workload can appear without a merge.</w:t>
+      </w:r>
+    </w:p>
+    <w:p>
+      <w:pPr>
+        <w:pStyle w:val="Compact"/>
+        <w:numPr>
+          <w:ilvl w:val="0"/>
+          <w:numId w:val="1005"/>
+        </w:numPr>
+      </w:pPr>
+      <w:r>
+        <w:rPr>
+          <w:rStyle w:val="VerbatimChar"/>
+          <w:b/>
+          <w:bCs/>
+        </w:rPr>
+        <w:t xml:space="preserve">imagePullPolicy: Always</w:t>
+      </w:r>
+      <w:r>
+        <w:rPr>
+          <w:b/>
+          <w:bCs/>
+        </w:rPr>
+        <w:t xml:space="preserve"> </w:t>
+      </w:r>
+      <w:r>
+        <w:rPr>
+          <w:b/>
+          <w:bCs/>
+        </w:rPr>
+        <w:t xml:space="preserve">with</w:t>
+      </w:r>
+      <w:r>
+        <w:rPr>
+          <w:b/>
+          <w:bCs/>
+        </w:rPr>
+        <w:t xml:space="preserve"> </w:t>
+      </w:r>
+      <w:r>
+        <w:rPr>
+          <w:rStyle w:val="VerbatimChar"/>
+          <w:b/>
+          <w:bCs/>
+        </w:rPr>
+        <w:t xml:space="preserve">:latest</w:t>
+      </w:r>
+      <w:r>
+        <w:rPr>
+          <w:b/>
+          <w:bCs/>
+        </w:rPr>
+        <w:t xml:space="preserve">.</w:t>
+      </w:r>
+      <w:r>
+        <w:t xml:space="preserve"> </w:t>
+      </w:r>
+      <w:r>
+        <w:t xml:space="preserve">It reintroduces exactly the "what is actually running"</w:t>
+      </w:r>
+      <w:r>
+        <w:t xml:space="preserve"> </w:t>
+      </w:r>
+      <w:r>
+        <w:t xml:space="preserve">ambiguity the version-asserting health check was built to remove.</w:t>
+      </w:r>
+    </w:p>
+    <w:bookmarkEnd w:id="30"/>
     <w:sectPr>
       <w:footnotePr>
         <w:numRestart w:val="eachSect"/>
@@ -1444,6 +1735,91 @@
       </w:rPr>
     </w:lvl>
   </w:abstractNum>
+  <w:abstractNum w:abstractNumId="99411">
+    <w:nsid w:val="00A99411"/>
+    <w:multiLevelType w:val="multilevel"/>
+    <w:lvl w:ilvl="0">
+      <w:start w:val="1"/>
+      <w:numFmt w:val="decimal"/>
+      <w:lvlText w:val="%1."/>
+      <w:lvlJc w:val="left"/>
+      <w:pPr>
+        <w:ind w:left="720" w:hanging="360"/>
+      </w:pPr>
+    </w:lvl>
+    <w:lvl w:ilvl="1">
+      <w:start w:val="1"/>
+      <w:numFmt w:val="decimal"/>
+      <w:lvlText w:val="%2."/>
+      <w:lvlJc w:val="left"/>
+      <w:pPr>
+        <w:ind w:left="1440" w:hanging="360"/>
+      </w:pPr>
+    </w:lvl>
+    <w:lvl w:ilvl="2">
+      <w:start w:val="1"/>
+      <w:numFmt w:val="decimal"/>
+      <w:lvlText w:val="%3."/>
+      <w:lvlJc w:val="left"/>
+      <w:pPr>
+        <w:ind w:left="2160" w:hanging="360"/>
+      </w:pPr>
+    </w:lvl>
+    <w:lvl w:ilvl="3">
+      <w:start w:val="1"/>
+      <w:numFmt w:val="decimal"/>
+      <w:lvlText w:val="%4."/>
+      <w:lvlJc w:val="left"/>
+      <w:pPr>
+        <w:ind w:left="2880" w:hanging="360"/>
+      </w:pPr>
+    </w:lvl>
+    <w:lvl w:ilvl="4">
+      <w:start w:val="1"/>
+      <w:numFmt w:val="decimal"/>
+      <w:lvlText w:val="%5."/>
+      <w:lvlJc w:val="left"/>
+      <w:pPr>
+        <w:ind w:left="3600" w:hanging="360"/>
+      </w:pPr>
+    </w:lvl>
+    <w:lvl w:ilvl="5">
+      <w:start w:val="1"/>
+      <w:numFmt w:val="decimal"/>
+      <w:lvlText w:val="%6."/>
+      <w:lvlJc w:val="left"/>
+      <w:pPr>
+        <w:ind w:left="4320" w:hanging="360"/>
+      </w:pPr>
+    </w:lvl>
+    <w:lvl w:ilvl="6">
+      <w:start w:val="1"/>
+      <w:numFmt w:val="decimal"/>
+      <w:lvlText w:val="%7."/>
+      <w:lvlJc w:val="left"/>
+      <w:pPr>
+        <w:ind w:left="5040" w:hanging="360"/>
+      </w:pPr>
+    </w:lvl>
+    <w:lvl w:ilvl="7">
+      <w:start w:val="1"/>
+      <w:numFmt w:val="decimal"/>
+      <w:lvlText w:val="%8."/>
+      <w:lvlJc w:val="left"/>
+      <w:pPr>
+        <w:ind w:left="5760" w:hanging="360"/>
+      </w:pPr>
+    </w:lvl>
+    <w:lvl w:ilvl="8">
+      <w:start w:val="1"/>
+      <w:numFmt w:val="decimal"/>
+      <w:lvlText w:val="%9."/>
+      <w:lvlJc w:val="left"/>
+      <w:pPr>
+        <w:ind w:left="6480" w:hanging="360"/>
+      </w:pPr>
+    </w:lvl>
+  </w:abstractNum>
   <w:num w:numId="1000">
     <w:abstractNumId w:val="990"/>
   </w:num>
@@ -1454,6 +1830,39 @@
     <w:abstractNumId w:val="991"/>
   </w:num>
   <w:num w:numId="1003">
+    <w:abstractNumId w:val="991"/>
+  </w:num>
+  <w:num w:numId="1004">
+    <w:abstractNumId w:val="99411"/>
+    <w:lvlOverride w:ilvl="0">
+      <w:startOverride w:val="1"/>
+    </w:lvlOverride>
+    <w:lvlOverride w:ilvl="1">
+      <w:startOverride w:val="1"/>
+    </w:lvlOverride>
+    <w:lvlOverride w:ilvl="2">
+      <w:startOverride w:val="1"/>
+    </w:lvlOverride>
+    <w:lvlOverride w:ilvl="3">
+      <w:startOverride w:val="1"/>
+    </w:lvlOverride>
+    <w:lvlOverride w:ilvl="4">
+      <w:startOverride w:val="1"/>
+    </w:lvlOverride>
+    <w:lvlOverride w:ilvl="5">
+      <w:startOverride w:val="1"/>
+    </w:lvlOverride>
+    <w:lvlOverride w:ilvl="6">
+      <w:startOverride w:val="1"/>
+    </w:lvlOverride>
+    <w:lvlOverride w:ilvl="7">
+      <w:startOverride w:val="1"/>
+    </w:lvlOverride>
+    <w:lvlOverride w:ilvl="8">
+      <w:startOverride w:val="1"/>
+    </w:lvlOverride>
+  </w:num>
+  <w:num w:numId="1005">
     <w:abstractNumId w:val="991"/>
   </w:num>
 </w:numbering>

</xml_diff>